<commit_message>
Refine description line gaps, fix header color, and match signature style with line
</commit_message>
<xml_diff>
--- a/ibogalab/test_facture.docx
+++ b/ibogalab/test_facture.docx
@@ -411,7 +411,7 @@
           </w:tcPr>
           <w:p>
             <w:pPr>
-              <w:spacing w:after="40"/>
+              <w:spacing w:before="0" w:after="40"/>
             </w:pPr>
             <w:r>
               <w:rPr>
@@ -424,7 +424,7 @@
           </w:p>
           <w:p>
             <w:pPr>
-              <w:spacing w:after="0"/>
+              <w:spacing w:before="0" w:after="0"/>
             </w:pPr>
             <w:r>
               <w:rPr>
@@ -821,20 +821,26 @@
         <w:tc>
           <w:tcPr>
             <w:tcW w:type="dxa" w:w="5090"/>
+            <w:tcBorders>
+              <w:top w:val="single" w:sz="4" w:space="0" w:color="E2E8F0"/>
+            </w:tcBorders>
+            <w:tcMar>
+              <w:top w:w="100" w:type="dxa"/>
+              <w:bottom w:w="100" w:type="dxa"/>
+              <w:left w:w="100" w:type="dxa"/>
+              <w:right w:w="100" w:type="dxa"/>
+            </w:tcMar>
           </w:tcPr>
           <w:p>
             <w:pPr>
-              <w:spacing w:after="800"/>
+              <w:spacing w:before="600" w:after="40"/>
               <w:jc w:val="center"/>
             </w:pPr>
             <w:r>
               <w:rPr>
-                <w:b/>
                 <w:sz w:val="17"/>
               </w:rPr>
               <w:t>Bon pour accord</w:t>
-              <w:br/>
-              <w:br/>
               <w:br/>
             </w:r>
             <w:r>
@@ -848,20 +854,23 @@
         <w:tc>
           <w:tcPr>
             <w:tcW w:type="dxa" w:w="5090"/>
+            <w:tcBorders>
+              <w:top w:val="single" w:sz="4" w:space="0" w:color="E2E8F0"/>
+            </w:tcBorders>
+            <w:tcMar>
+              <w:top w:w="100" w:type="dxa"/>
+              <w:bottom w:w="100" w:type="dxa"/>
+              <w:left w:w="100" w:type="dxa"/>
+              <w:right w:w="100" w:type="dxa"/>
+            </w:tcMar>
           </w:tcPr>
           <w:p>
             <w:pPr>
-              <w:spacing w:after="800"/>
+              <w:spacing w:before="600" w:after="40"/>
               <w:jc w:val="center"/>
             </w:pPr>
             <w:r>
-              <w:br/>
-              <w:br/>
-              <w:br/>
-            </w:r>
-            <w:r>
               <w:rPr>
-                <w:b/>
                 <w:sz w:val="17"/>
               </w:rPr>
               <w:t>Cachet et Signature de l'Agence</w:t>

</xml_diff>

<commit_message>
Add phone support and dynamically omit empty company info
</commit_message>
<xml_diff>
--- a/ibogalab/test_facture.docx
+++ b/ibogalab/test_facture.docx
@@ -79,11 +79,9 @@
               </w:rPr>
               <w:t>Libreville, Gabon</w:t>
               <w:br/>
-              <w:t>contact@ibogalab.com</w:t>
+              <w:t>contact@ibogalab.tech</w:t>
               <w:br/>
-              <w:t>RCCM: [Votre Numéro]</w:t>
-              <w:br/>
-              <w:t>NIF: [Votre NIF]</w:t>
+              <w:t>www.ibogalab.tech</w:t>
             </w:r>
           </w:p>
         </w:tc>

</xml_diff>